<commit_message>
Corriger sample.docx : partie styles.xml manquante (reference Heading1 orpheline)
Le docx synthetique referançait le style Heading1 sans embarquer word/styles.xml :
le convertisseur ODF de x2t segfaultait (code 139) sur docx->odt. Ajout de
styles.xml + rels : les 5 sorties testees (pdf, html, odt, rtf, txt) passent.
Verifie : E2E sur l exe publie, smoke test OK.
</commit_message>
<xml_diff>
--- a/build/testdata/sample.docx
+++ b/build/testdata/sample.docx
@@ -23,4 +23,31 @@
     <w:sectPr/>
   </w:body>
 </w:document>
+</file>
+
+<file path=word/styles.xml><?xml version="1.0" encoding="utf-8"?>
+<w:styles xmlns:w="http://schemas.openxmlformats.org/wordprocessingml/2006/main">
+  <w:docDefaults>
+    <w:rPrDefault>
+      <w:rPr>
+        <w:sz w:val="22"/>
+      </w:rPr>
+    </w:rPrDefault>
+    <w:pPrDefault/>
+  </w:docDefaults>
+  <w:style w:type="paragraph" w:default="1" w:styleId="Normal">
+    <w:name w:val="Normal"/>
+  </w:style>
+  <w:style w:type="paragraph" w:styleId="Heading1">
+    <w:name w:val="heading 1"/>
+    <w:basedOn w:val="Normal"/>
+    <w:pPr>
+      <w:outlineLvl w:val="0"/>
+    </w:pPr>
+    <w:rPr>
+      <w:b/>
+      <w:sz w:val="32"/>
+    </w:rPr>
+  </w:style>
+</w:styles>
 </file>
</xml_diff>